<commit_message>
Add GitHub repository and demo video links to README and report
</commit_message>
<xml_diff>
--- a/report/report.docx
+++ b/report/report.docx
@@ -70,13 +70,16 @@
               <w:spacing w:after="0" w:line="240" w:lineRule="auto"/>
             </w:pPr>
             <w:r/>
-            <w:r>
-              <w:rPr>
-                <w:i/>
-                <w:sz w:val="19"/>
-              </w:rPr>
-              <w:t>[to add after the repository is published]</w:t>
-            </w:r>
+            <w:hyperlink r:id="rId10">
+              <w:r>
+                <w:rPr>
+                  <w:color w:val="1F5FB4"/>
+                  <w:u w:val="single"/>
+                  <w:sz w:val="19"/>
+                </w:rPr>
+                <w:t xml:space="preserve">https://github.com/Orrie-Dan/afrimed-qa-assistant</w:t>
+              </w:r>
+            </w:hyperlink>
           </w:p>
         </w:tc>
       </w:tr>
@@ -107,13 +110,16 @@
               <w:spacing w:after="0" w:line="240" w:lineRule="auto"/>
             </w:pPr>
             <w:r/>
-            <w:r>
-              <w:rPr>
-                <w:i/>
-                <w:sz w:val="19"/>
-              </w:rPr>
-              <w:t>[to add]</w:t>
-            </w:r>
+            <w:hyperlink r:id="rId11">
+              <w:r>
+                <w:rPr>
+                  <w:color w:val="1F5FB4"/>
+                  <w:u w:val="single"/>
+                  <w:sz w:val="19"/>
+                </w:rPr>
+                <w:t xml:space="preserve">https://youtu.be/r-1iQLhY5ek</w:t>
+              </w:r>
+            </w:hyperlink>
           </w:p>
         </w:tc>
       </w:tr>
@@ -144,7 +150,7 @@
               <w:spacing w:after="0" w:line="240" w:lineRule="auto"/>
             </w:pPr>
             <w:r/>
-            <w:hyperlink r:id="rId10">
+            <w:hyperlink r:id="rId12">
               <w:r>
                 <w:rPr>
                   <w:color w:val="1F5FB4"/>
@@ -4042,7 +4048,7 @@
                     <pic:cNvPicPr/>
                   </pic:nvPicPr>
                   <pic:blipFill>
-                    <a:blip r:embed="rId11"/>
+                    <a:blip r:embed="rId13"/>
                     <a:stretch>
                       <a:fillRect/>
                     </a:stretch>
@@ -5254,7 +5260,7 @@
                     <pic:cNvPicPr/>
                   </pic:nvPicPr>
                   <pic:blipFill>
-                    <a:blip r:embed="rId12"/>
+                    <a:blip r:embed="rId14"/>
                     <a:stretch>
                       <a:fillRect/>
                     </a:stretch>
@@ -7124,7 +7130,7 @@
         <w:rPr/>
         <w:t xml:space="preserve"> (arXiv:1906.02569). arXiv. </w:t>
       </w:r>
-      <w:hyperlink r:id="rId13">
+      <w:hyperlink r:id="rId15">
         <w:r>
           <w:rPr>
             <w:color w:val="1F5FB4"/>
@@ -7152,7 +7158,7 @@
         <w:rPr/>
         <w:t xml:space="preserve"> (arXiv:2311.16079). arXiv. </w:t>
       </w:r>
-      <w:hyperlink r:id="rId14">
+      <w:hyperlink r:id="rId16">
         <w:r>
           <w:rPr>
             <w:color w:val="1F5FB4"/>
@@ -7180,7 +7186,7 @@
         <w:rPr/>
         <w:t xml:space="preserve">. Databricks Blog. </w:t>
       </w:r>
-      <w:hyperlink r:id="rId15">
+      <w:hyperlink r:id="rId17">
         <w:r>
           <w:rPr>
             <w:color w:val="1F5FB4"/>
@@ -7208,7 +7214,7 @@
         <w:rPr/>
         <w:t xml:space="preserve">. </w:t>
       </w:r>
-      <w:hyperlink r:id="rId16">
+      <w:hyperlink r:id="rId18">
         <w:r>
           <w:rPr>
             <w:color w:val="1F5FB4"/>
@@ -7255,7 +7261,7 @@
         <w:rPr/>
         <w:t xml:space="preserve">. </w:t>
       </w:r>
-      <w:hyperlink r:id="rId17">
+      <w:hyperlink r:id="rId19">
         <w:r>
           <w:rPr>
             <w:color w:val="1F5FB4"/>
@@ -7283,7 +7289,7 @@
         <w:rPr/>
         <w:t xml:space="preserve">, 665–673. </w:t>
       </w:r>
-      <w:hyperlink r:id="rId18">
+      <w:hyperlink r:id="rId20">
         <w:r>
           <w:rPr>
             <w:color w:val="1F5FB4"/>
@@ -7311,7 +7317,7 @@
         <w:rPr/>
         <w:t xml:space="preserve"> (pp. 107–112). </w:t>
       </w:r>
-      <w:hyperlink r:id="rId19">
+      <w:hyperlink r:id="rId21">
         <w:r>
           <w:rPr>
             <w:color w:val="1F5FB4"/>
@@ -7339,7 +7345,7 @@
         <w:rPr/>
         <w:t xml:space="preserve">. </w:t>
       </w:r>
-      <w:hyperlink r:id="rId20">
+      <w:hyperlink r:id="rId22">
         <w:r>
           <w:rPr>
             <w:color w:val="1F5FB4"/>
@@ -7367,7 +7373,7 @@
         <w:rPr/>
         <w:t xml:space="preserve">. </w:t>
       </w:r>
-      <w:hyperlink r:id="rId21">
+      <w:hyperlink r:id="rId23">
         <w:r>
           <w:rPr>
             <w:color w:val="1F5FB4"/>
@@ -7395,7 +7401,7 @@
         <w:rPr/>
         <w:t xml:space="preserve">. </w:t>
       </w:r>
-      <w:hyperlink r:id="rId22">
+      <w:hyperlink r:id="rId24">
         <w:r>
           <w:rPr>
             <w:color w:val="1F5FB4"/>
@@ -7423,7 +7429,7 @@
         <w:rPr/>
         <w:t xml:space="preserve">(12), 1–38. </w:t>
       </w:r>
-      <w:hyperlink r:id="rId23">
+      <w:hyperlink r:id="rId25">
         <w:r>
           <w:rPr>
             <w:color w:val="1F5FB4"/>
@@ -7451,7 +7457,7 @@
         <w:rPr/>
         <w:t xml:space="preserve">(14), 6421. </w:t>
       </w:r>
-      <w:hyperlink r:id="rId24">
+      <w:hyperlink r:id="rId26">
         <w:r>
           <w:rPr>
             <w:color w:val="1F5FB4"/>
@@ -7479,7 +7485,7 @@
         <w:rPr/>
         <w:t xml:space="preserve">. </w:t>
       </w:r>
-      <w:hyperlink r:id="rId25">
+      <w:hyperlink r:id="rId27">
         <w:r>
           <w:rPr>
             <w:color w:val="1F5FB4"/>
@@ -7507,7 +7513,7 @@
         <w:rPr/>
         <w:t xml:space="preserve"> [Dataset]. Hugging Face. </w:t>
       </w:r>
-      <w:hyperlink r:id="rId26">
+      <w:hyperlink r:id="rId28">
         <w:r>
           <w:rPr>
             <w:color w:val="1F5FB4"/>
@@ -7535,7 +7541,7 @@
         <w:rPr/>
         <w:t xml:space="preserve">. </w:t>
       </w:r>
-      <w:hyperlink r:id="rId27">
+      <w:hyperlink r:id="rId29">
         <w:r>
           <w:rPr>
             <w:color w:val="1F5FB4"/>
@@ -7582,7 +7588,7 @@
         <w:rPr/>
         <w:t xml:space="preserve"> [Computer software]. </w:t>
       </w:r>
-      <w:hyperlink r:id="rId28">
+      <w:hyperlink r:id="rId30">
         <w:r>
           <w:rPr>
             <w:color w:val="1F5FB4"/>
@@ -7629,7 +7635,7 @@
         <w:rPr/>
         <w:t xml:space="preserve">. </w:t>
       </w:r>
-      <w:hyperlink r:id="rId29">
+      <w:hyperlink r:id="rId31">
         <w:r>
           <w:rPr>
             <w:color w:val="1F5FB4"/>
@@ -7657,7 +7663,7 @@
         <w:rPr/>
         <w:t xml:space="preserve"> (pp. 1948–1973). Association for Computational Linguistics. </w:t>
       </w:r>
-      <w:hyperlink r:id="rId30">
+      <w:hyperlink r:id="rId32">
         <w:r>
           <w:rPr>
             <w:color w:val="1F5FB4"/>
@@ -7670,7 +7676,7 @@
         <w:rPr/>
         <w:t xml:space="preserve"> · Data and results: </w:t>
       </w:r>
-      <w:hyperlink r:id="rId31">
+      <w:hyperlink r:id="rId33">
         <w:r>
           <w:rPr>
             <w:color w:val="1F5FB4"/>
@@ -7698,7 +7704,7 @@
         <w:rPr/>
         <w:t xml:space="preserve"> (PMLR 174). </w:t>
       </w:r>
-      <w:hyperlink r:id="rId32">
+      <w:hyperlink r:id="rId34">
         <w:r>
           <w:rPr>
             <w:color w:val="1F5FB4"/>
@@ -7726,7 +7732,7 @@
         <w:rPr/>
         <w:t xml:space="preserve">. </w:t>
       </w:r>
-      <w:hyperlink r:id="rId33">
+      <w:hyperlink r:id="rId35">
         <w:r>
           <w:rPr>
             <w:color w:val="1F5FB4"/>
@@ -7773,7 +7779,7 @@
         <w:rPr/>
         <w:t xml:space="preserve"> (arXiv:2412.15115). arXiv. </w:t>
       </w:r>
-      <w:hyperlink r:id="rId34">
+      <w:hyperlink r:id="rId36">
         <w:r>
           <w:rPr>
             <w:color w:val="1F5FB4"/>
@@ -7801,7 +7807,7 @@
         <w:rPr/>
         <w:t xml:space="preserve"> (pp. 2383–2392). </w:t>
       </w:r>
-      <w:hyperlink r:id="rId35">
+      <w:hyperlink r:id="rId37">
         <w:r>
           <w:rPr>
             <w:color w:val="1F5FB4"/>
@@ -7848,7 +7854,7 @@
         <w:rPr/>
         <w:t xml:space="preserve">, 172–180. </w:t>
       </w:r>
-      <w:hyperlink r:id="rId36">
+      <w:hyperlink r:id="rId38">
         <w:r>
           <w:rPr>
             <w:color w:val="1F5FB4"/>
@@ -7876,7 +7882,7 @@
         <w:rPr/>
         <w:t xml:space="preserve"> (arXiv:2305.09617). arXiv. </w:t>
       </w:r>
-      <w:hyperlink r:id="rId37">
+      <w:hyperlink r:id="rId39">
         <w:r>
           <w:rPr>
             <w:color w:val="1F5FB4"/>
@@ -7904,7 +7910,7 @@
         <w:rPr/>
         <w:t xml:space="preserve"> (pp. 38–45). </w:t>
       </w:r>
-      <w:hyperlink r:id="rId38">
+      <w:hyperlink r:id="rId40">
         <w:r>
           <w:rPr>
             <w:color w:val="1F5FB4"/>
@@ -7932,7 +7938,7 @@
         <w:rPr/>
         <w:t xml:space="preserve">. </w:t>
       </w:r>
-      <w:hyperlink r:id="rId39">
+      <w:hyperlink r:id="rId41">
         <w:r>
           <w:rPr>
             <w:color w:val="1F5FB4"/>
@@ -7960,7 +7966,7 @@
         <w:rPr/>
         <w:t xml:space="preserve">. Retrieved October 17, 2026, from </w:t>
       </w:r>
-      <w:hyperlink r:id="rId40">
+      <w:hyperlink r:id="rId42">
         <w:r>
           <w:rPr>
             <w:color w:val="1F5FB4"/>
@@ -7988,7 +7994,7 @@
         <w:rPr/>
         <w:t xml:space="preserve">. </w:t>
       </w:r>
-      <w:hyperlink r:id="rId41">
+      <w:hyperlink r:id="rId43">
         <w:r>
           <w:rPr>
             <w:color w:val="1F5FB4"/>
@@ -8016,7 +8022,7 @@
         <w:rPr/>
         <w:t xml:space="preserve">. </w:t>
       </w:r>
-      <w:hyperlink r:id="rId42">
+      <w:hyperlink r:id="rId44">
         <w:r>
           <w:rPr>
             <w:color w:val="1F5FB4"/>
@@ -8044,7 +8050,7 @@
         <w:rPr/>
         <w:t xml:space="preserve">. </w:t>
       </w:r>
-      <w:hyperlink r:id="rId43">
+      <w:hyperlink r:id="rId45">
         <w:r>
           <w:rPr>
             <w:color w:val="1F5FB4"/>

</xml_diff>

<commit_message>
Drop the manual rating from the evaluation; keep the protocol as future work
The report now assesses SAQ correctness through qualitative error analysis
only. Section 7.3 (rating results) is removed, limitations and future work are
updated, and the rating guide is marked as prepared but not run.
</commit_message>
<xml_diff>
--- a/report/report.docx
+++ b/report/report.docx
@@ -290,7 +290,7 @@
       </w:r>
       <w:r>
         <w:rPr/>
-        <w:t xml:space="preserve"> I added an MCQ metric that reads which option the model rates most likely, together with paired McNemar tests. This showed that at 1.5B most of the MCQ gain comes from the model learning to commit to a single answer: the knowledge-level gain (0.479 → 0.508) is not statistically significant. Model size was the largest effect. Several high-overlap short answers were also factually wrong, so a blind manual correctness and safety rating complements the automatic metrics.</w:t>
+        <w:t xml:space="preserve"> I added an MCQ metric that reads which option the model rates most likely, together with paired McNemar tests. This showed that at 1.5B most of the MCQ gain comes from the model learning to commit to a single answer: the knowledge-level gain (0.479 → 0.508) is not statistically significant. Model size was the largest effect. Error analysis also showed that several high-overlap short answers were factually wrong, so the overlap metrics overstate answer quality.</w:t>
       </w:r>
     </w:p>
     <w:p>
@@ -2512,43 +2512,6 @@
       <w:r>
         <w:rPr/>
         <w:t xml:space="preserve"> model choice uses validation data only; test results are reported, never used to choose.</w:t>
-      </w:r>
-    </w:p>
-    <w:p>
-      <w:pPr>
-        <w:pStyle w:val="ListBullet"/>
-        <w:spacing w:after="60"/>
-      </w:pPr>
-      <w:r>
-        <w:rPr>
-          <w:b/>
-        </w:rPr>
-        <w:t>Manual rating:</w:t>
-      </w:r>
-      <w:r>
-        <w:rPr/>
-        <w:t xml:space="preserve"> 40 test SAQs (20 expert, 20 crowdsourced). The deployed model and the zero-shot 1.5B model are rated </w:t>
-      </w:r>
-      <w:r>
-        <w:rPr>
-          <w:b/>
-        </w:rPr>
-        <w:t>blind</w:t>
-      </w:r>
-      <w:r>
-        <w:rPr/>
-        <w:t>, with randomised A/B order. Correctness is scored 0/1/2 and unsafe yes/no, judged on medical facts rather than agreement with the reference (</w:t>
-      </w:r>
-      <w:r>
-        <w:rPr>
-          <w:rFonts w:ascii="Consolas" w:hAnsi="Consolas" w:eastAsia="Consolas"/>
-          <w:sz w:val="20"/>
-        </w:rPr>
-        <w:t>docs/rating_guide.md</w:t>
-      </w:r>
-      <w:r>
-        <w:rPr/>
-        <w:t>).</w:t>
       </w:r>
     </w:p>
     <w:p>
@@ -6114,7 +6077,7 @@
       </w:r>
       <w:r>
         <w:rPr/>
-        <w:t xml:space="preserve"> Some "errors" are reference errors, such as the duodenal-atresia label in Section 4.2. This is another reason why rating must judge medical facts, not agreement with the reference.</w:t>
+        <w:t xml:space="preserve"> Some "errors" are reference errors, such as the duodenal-atresia label in Section 4.2. This is another reason why evaluation should judge medical facts, not only agreement with the reference.</w:t>
       </w:r>
     </w:p>
     <w:p>
@@ -6123,385 +6086,7 @@
       </w:pPr>
       <w:r>
         <w:rPr/>
-        <w:t>7.3 Manual correctness and safety rating</w:t>
-      </w:r>
-    </w:p>
-    <w:p>
-      <w:pPr>
-        <w:ind w:left="432"/>
-        <w:pBdr>
-          <w:left w:val="single" w:sz="18" w:space="8" w:color="9DB7DC"/>
-        </w:pBdr>
-      </w:pPr>
-      <w:r>
-        <w:rPr>
-          <w:b/>
-        </w:rPr>
-        <w:t>[TO COMPLETE after rating]</w:t>
-      </w:r>
-      <w:r>
-        <w:rPr/>
-        <w:t xml:space="preserve"> Run </w:t>
-      </w:r>
-      <w:r>
-        <w:rPr>
-          <w:rFonts w:ascii="Consolas" w:hAnsi="Consolas" w:eastAsia="Consolas"/>
-          <w:sz w:val="20"/>
-        </w:rPr>
-        <w:t>python -P scripts/score_ratings.py</w:t>
-      </w:r>
-      <w:r>
-        <w:rPr/>
-        <w:t>, then fill in the table and the paragraph.</w:t>
-      </w:r>
-    </w:p>
-    <w:p>
-      <w:r>
-        <w:rPr>
-          <w:b/>
-        </w:rPr>
-        <w:t>Table 3. Blind manual rating, 40 test SAQs.</w:t>
-      </w:r>
-    </w:p>
-    <w:tbl>
-      <w:tblPr>
-        <w:tblStyle w:val="TableGrid"/>
-        <w:tblW w:type="auto" w:w="0"/>
-        <w:jc w:val="center"/>
-        <w:tblLayout w:type="fixed"/>
-        <w:tblLook w:firstColumn="1" w:firstRow="1" w:lastColumn="0" w:lastRow="0" w:noHBand="0" w:noVBand="1" w:val="04A0"/>
-      </w:tblPr>
-      <w:tblGrid>
-        <w:gridCol w:w="1505"/>
-        <w:gridCol w:w="1505"/>
-        <w:gridCol w:w="1505"/>
-        <w:gridCol w:w="1505"/>
-        <w:gridCol w:w="1505"/>
-        <w:gridCol w:w="1505"/>
-      </w:tblGrid>
-      <w:tr>
-        <w:tc>
-          <w:tcPr>
-            <w:tcW w:type="dxa" w:w="2621"/>
-            <w:shd w:val="clear" w:color="auto" w:fill="E8EEF7"/>
-          </w:tcPr>
-          <w:p>
-            <w:pPr>
-              <w:spacing w:after="0" w:line="240" w:lineRule="auto"/>
-            </w:pPr>
-            <w:r/>
-            <w:r>
-              <w:rPr>
-                <w:b/>
-                <w:sz w:val="17"/>
-              </w:rPr>
-              <w:t>Model</w:t>
-            </w:r>
-          </w:p>
-        </w:tc>
-        <w:tc>
-          <w:tcPr>
-            <w:tcW w:type="dxa" w:w="1456"/>
-            <w:shd w:val="clear" w:color="auto" w:fill="E8EEF7"/>
-          </w:tcPr>
-          <w:p>
-            <w:pPr>
-              <w:spacing w:after="0" w:line="240" w:lineRule="auto"/>
-            </w:pPr>
-            <w:r/>
-            <w:r>
-              <w:rPr>
-                <w:b/>
-                <w:sz w:val="17"/>
-              </w:rPr>
-              <w:t>Correct (2)</w:t>
-            </w:r>
-          </w:p>
-        </w:tc>
-        <w:tc>
-          <w:tcPr>
-            <w:tcW w:type="dxa" w:w="1359"/>
-            <w:shd w:val="clear" w:color="auto" w:fill="E8EEF7"/>
-          </w:tcPr>
-          <w:p>
-            <w:pPr>
-              <w:spacing w:after="0" w:line="240" w:lineRule="auto"/>
-            </w:pPr>
-            <w:r/>
-            <w:r>
-              <w:rPr>
-                <w:b/>
-                <w:sz w:val="17"/>
-              </w:rPr>
-              <w:t>Partly (1)</w:t>
-            </w:r>
-          </w:p>
-        </w:tc>
-        <w:tc>
-          <w:tcPr>
-            <w:tcW w:type="dxa" w:w="1262"/>
-            <w:shd w:val="clear" w:color="auto" w:fill="E8EEF7"/>
-          </w:tcPr>
-          <w:p>
-            <w:pPr>
-              <w:spacing w:after="0" w:line="240" w:lineRule="auto"/>
-            </w:pPr>
-            <w:r/>
-            <w:r>
-              <w:rPr>
-                <w:b/>
-                <w:sz w:val="17"/>
-              </w:rPr>
-              <w:t>Wrong (0)</w:t>
-            </w:r>
-          </w:p>
-        </w:tc>
-        <w:tc>
-          <w:tcPr>
-            <w:tcW w:type="dxa" w:w="971"/>
-            <w:shd w:val="clear" w:color="auto" w:fill="E8EEF7"/>
-          </w:tcPr>
-          <w:p>
-            <w:pPr>
-              <w:spacing w:after="0" w:line="240" w:lineRule="auto"/>
-            </w:pPr>
-            <w:r/>
-            <w:r>
-              <w:rPr>
-                <w:b/>
-                <w:sz w:val="17"/>
-              </w:rPr>
-              <w:t>Unsafe</w:t>
-            </w:r>
-          </w:p>
-        </w:tc>
-        <w:tc>
-          <w:tcPr>
-            <w:tcW w:type="dxa" w:w="1359"/>
-            <w:shd w:val="clear" w:color="auto" w:fill="E8EEF7"/>
-          </w:tcPr>
-          <w:p>
-            <w:pPr>
-              <w:spacing w:after="0" w:line="240" w:lineRule="auto"/>
-            </w:pPr>
-            <w:r/>
-            <w:r>
-              <w:rPr>
-                <w:b/>
-                <w:sz w:val="17"/>
-              </w:rPr>
-              <w:t>Mean (0–2)</w:t>
-            </w:r>
-          </w:p>
-        </w:tc>
-      </w:tr>
-      <w:tr>
-        <w:tc>
-          <w:tcPr>
-            <w:tcW w:type="dxa" w:w="2621"/>
-          </w:tcPr>
-          <w:p>
-            <w:pPr>
-              <w:spacing w:after="0" w:line="240" w:lineRule="auto"/>
-            </w:pPr>
-            <w:r/>
-            <w:r>
-              <w:rPr>
-                <w:sz w:val="17"/>
-              </w:rPr>
-              <w:t>E0 zero-shot 1.5B</w:t>
-            </w:r>
-          </w:p>
-        </w:tc>
-        <w:tc>
-          <w:tcPr>
-            <w:tcW w:type="dxa" w:w="1456"/>
-          </w:tcPr>
-          <w:p>
-            <w:pPr>
-              <w:spacing w:after="0" w:line="240" w:lineRule="auto"/>
-            </w:pPr>
-            <w:r/>
-          </w:p>
-        </w:tc>
-        <w:tc>
-          <w:tcPr>
-            <w:tcW w:type="dxa" w:w="1359"/>
-          </w:tcPr>
-          <w:p>
-            <w:pPr>
-              <w:spacing w:after="0" w:line="240" w:lineRule="auto"/>
-            </w:pPr>
-            <w:r/>
-          </w:p>
-        </w:tc>
-        <w:tc>
-          <w:tcPr>
-            <w:tcW w:type="dxa" w:w="1262"/>
-          </w:tcPr>
-          <w:p>
-            <w:pPr>
-              <w:spacing w:after="0" w:line="240" w:lineRule="auto"/>
-            </w:pPr>
-            <w:r/>
-          </w:p>
-        </w:tc>
-        <w:tc>
-          <w:tcPr>
-            <w:tcW w:type="dxa" w:w="971"/>
-          </w:tcPr>
-          <w:p>
-            <w:pPr>
-              <w:spacing w:after="0" w:line="240" w:lineRule="auto"/>
-            </w:pPr>
-            <w:r/>
-          </w:p>
-        </w:tc>
-        <w:tc>
-          <w:tcPr>
-            <w:tcW w:type="dxa" w:w="1359"/>
-          </w:tcPr>
-          <w:p>
-            <w:pPr>
-              <w:spacing w:after="0" w:line="240" w:lineRule="auto"/>
-            </w:pPr>
-            <w:r/>
-          </w:p>
-        </w:tc>
-      </w:tr>
-      <w:tr>
-        <w:tc>
-          <w:tcPr>
-            <w:tcW w:type="dxa" w:w="2621"/>
-          </w:tcPr>
-          <w:p>
-            <w:pPr>
-              <w:spacing w:after="0" w:line="240" w:lineRule="auto"/>
-            </w:pPr>
-            <w:r/>
-            <w:r>
-              <w:rPr>
-                <w:sz w:val="17"/>
-              </w:rPr>
-              <w:t>E3 LoRA 1.5B (deployed)</w:t>
-            </w:r>
-          </w:p>
-        </w:tc>
-        <w:tc>
-          <w:tcPr>
-            <w:tcW w:type="dxa" w:w="1456"/>
-          </w:tcPr>
-          <w:p>
-            <w:pPr>
-              <w:spacing w:after="0" w:line="240" w:lineRule="auto"/>
-            </w:pPr>
-            <w:r/>
-          </w:p>
-        </w:tc>
-        <w:tc>
-          <w:tcPr>
-            <w:tcW w:type="dxa" w:w="1359"/>
-          </w:tcPr>
-          <w:p>
-            <w:pPr>
-              <w:spacing w:after="0" w:line="240" w:lineRule="auto"/>
-            </w:pPr>
-            <w:r/>
-          </w:p>
-        </w:tc>
-        <w:tc>
-          <w:tcPr>
-            <w:tcW w:type="dxa" w:w="1262"/>
-          </w:tcPr>
-          <w:p>
-            <w:pPr>
-              <w:spacing w:after="0" w:line="240" w:lineRule="auto"/>
-            </w:pPr>
-            <w:r/>
-          </w:p>
-        </w:tc>
-        <w:tc>
-          <w:tcPr>
-            <w:tcW w:type="dxa" w:w="971"/>
-          </w:tcPr>
-          <w:p>
-            <w:pPr>
-              <w:spacing w:after="0" w:line="240" w:lineRule="auto"/>
-            </w:pPr>
-            <w:r/>
-          </w:p>
-        </w:tc>
-        <w:tc>
-          <w:tcPr>
-            <w:tcW w:type="dxa" w:w="1359"/>
-          </w:tcPr>
-          <w:p>
-            <w:pPr>
-              <w:spacing w:after="0" w:line="240" w:lineRule="auto"/>
-            </w:pPr>
-            <w:r/>
-          </w:p>
-        </w:tc>
-      </w:tr>
-    </w:tbl>
-    <w:p>
-      <w:pPr>
-        <w:spacing w:after="40"/>
-      </w:pPr>
-    </w:p>
-    <w:p>
-      <w:r>
-        <w:rPr>
-          <w:i/>
-        </w:rPr>
-        <w:t>[Paired test on "correct" and interpretation: does fine-tuning make answers more correct, or only shorter? Compare with ROUGE-L, and note references flagged as wrong.]</w:t>
-      </w:r>
-    </w:p>
-    <w:p>
-      <w:r>
-        <w:rPr>
-          <w:b/>
-        </w:rPr>
-        <w:t>Limits of the rating:</w:t>
-      </w:r>
-    </w:p>
-    <w:p>
-      <w:pPr>
-        <w:pStyle w:val="ListBullet"/>
-        <w:spacing w:after="60"/>
-      </w:pPr>
-      <w:r>
-        <w:rPr/>
-        <w:t>There is one rater, who is not a medical professional.</w:t>
-      </w:r>
-    </w:p>
-    <w:p>
-      <w:pPr>
-        <w:pStyle w:val="ListBullet"/>
-        <w:spacing w:after="60"/>
-      </w:pPr>
-      <w:r>
-        <w:rPr/>
-        <w:t>The sample is 40 questions.</w:t>
-      </w:r>
-    </w:p>
-    <w:p>
-      <w:pPr>
-        <w:pStyle w:val="ListBullet"/>
-        <w:spacing w:after="60"/>
-      </w:pPr>
-      <w:r>
-        <w:rPr/>
-        <w:t>Blinding is imperfect, because answer length often reveals the model.</w:t>
-      </w:r>
-    </w:p>
-    <w:p>
-      <w:pPr>
-        <w:pStyle w:val="Heading2"/>
-      </w:pPr>
-      <w:r>
-        <w:rPr/>
-        <w:t>7.4 Discussion</w:t>
+        <w:t>7.3 Discussion</w:t>
       </w:r>
     </w:p>
     <w:p>
@@ -6845,7 +6430,7 @@
       </w:pPr>
       <w:r>
         <w:rPr/>
-        <w:t>The manual rating has a single non-expert rater and 40 questions.</w:t>
+        <w:t>SAQ correctness was assessed only qualitatively, through the examples in Section 7.2; no systematic human rating was done.</w:t>
       </w:r>
     </w:p>
     <w:p>
@@ -6961,7 +6546,18 @@
       </w:pPr>
       <w:r>
         <w:rPr/>
-        <w:t>Multiple clinician raters with inter-rater agreement.</w:t>
+        <w:t>A blind human correctness and safety rating of SAQ answers, ideally by several clinicians with inter-rater agreement. A protocol and a blind A/B rating sheet are already prepared in the repository (</w:t>
+      </w:r>
+      <w:r>
+        <w:rPr>
+          <w:rFonts w:ascii="Consolas" w:hAnsi="Consolas" w:eastAsia="Consolas"/>
+          <w:sz w:val="20"/>
+        </w:rPr>
+        <w:t>docs/rating_guide.md</w:t>
+      </w:r>
+      <w:r>
+        <w:rPr/>
+        <w:t>).</w:t>
       </w:r>
     </w:p>
     <w:p>
@@ -8174,7 +7770,7 @@
       </w:pPr>
       <w:r>
         <w:rPr/>
-        <w:t>the blind rating protocol;</w:t>
+        <w:t>a blind rating protocol (prepared for future work, not run);</w:t>
       </w:r>
     </w:p>
     <w:p>

</xml_diff>

<commit_message>
Remove AI-use statement placeholder from the report
</commit_message>
<xml_diff>
--- a/report/report.docx
+++ b/report/report.docx
@@ -174,24 +174,6 @@
       <w:pPr>
         <w:spacing w:after="40"/>
       </w:pPr>
-    </w:p>
-    <w:p>
-      <w:pPr>
-        <w:ind w:left="432"/>
-        <w:pBdr>
-          <w:left w:val="single" w:sz="18" w:space="8" w:color="9DB7DC"/>
-        </w:pBdr>
-      </w:pPr>
-      <w:r>
-        <w:rPr>
-          <w:b/>
-        </w:rPr>
-        <w:t>[AUTHOR TO COMPLETE: statement on AI assistance.]</w:t>
-      </w:r>
-      <w:r>
-        <w:rPr/>
-        <w:t xml:space="preserve"> If ALU's policy requires it, state here which parts of the work used AI tools (for example code drafting and report drafting) and confirm that you checked, ran and can explain all submitted work.</w:t>
-      </w:r>
     </w:p>
     <w:p>
       <w:pPr>

</xml_diff>

<commit_message>
Stop tracking report source, report build helpers and rating material
Kept locally and listed in .gitignore. README and report no longer link to them;
the submitted report is report/report.docx with report/figures/.
</commit_message>
<xml_diff>
--- a/report/report.docx
+++ b/report/report.docx
@@ -6528,18 +6528,7 @@
       </w:pPr>
       <w:r>
         <w:rPr/>
-        <w:t>A blind human correctness and safety rating of SAQ answers, ideally by several clinicians with inter-rater agreement. A protocol and a blind A/B rating sheet are already prepared in the repository (</w:t>
-      </w:r>
-      <w:r>
-        <w:rPr>
-          <w:rFonts w:ascii="Consolas" w:hAnsi="Consolas" w:eastAsia="Consolas"/>
-          <w:sz w:val="20"/>
-        </w:rPr>
-        <w:t>docs/rating_guide.md</w:t>
-      </w:r>
-      <w:r>
-        <w:rPr/>
-        <w:t>).</w:t>
+        <w:t>A blind human correctness and safety rating of SAQ answers, ideally by several clinicians with inter-rater agreement.</w:t>
       </w:r>
     </w:p>
     <w:p>
@@ -7743,16 +7732,6 @@
       <w:r>
         <w:rPr/>
         <w:t>the crisis rule, streaming app and Space packaging;</w:t>
-      </w:r>
-    </w:p>
-    <w:p>
-      <w:pPr>
-        <w:pStyle w:val="ListBullet2"/>
-        <w:spacing w:after="60"/>
-      </w:pPr>
-      <w:r>
-        <w:rPr/>
-        <w:t>a blind rating protocol (prepared for future work, not run);</w:t>
       </w:r>
     </w:p>
     <w:p>

</xml_diff>